<commit_message>
Police Aptos + pied de page + alignement dates
</commit_message>
<xml_diff>
--- a/backend/assets/Template_Adyton_BASE.docx
+++ b/backend/assets/Template_Adyton_BASE.docx
@@ -6,7 +6,7 @@
       <w:pPr>
         <w:jc w:val="center"/>
         <w:rPr>
-          <w:rFonts w:ascii="Roboto" w:hAnsi="Roboto"/>
+          <w:rFonts w:ascii="Aptos" w:hAnsi="Aptos"/>
           <w:b/>
           <w:bCs/>
           <w:color w:val="17457A"/>
@@ -16,7 +16,7 @@
       </w:pPr>
       <w:r>
         <w:rPr>
-          <w:rFonts w:ascii="Roboto" w:hAnsi="Roboto"/>
+          <w:rFonts w:ascii="Aptos" w:hAnsi="Aptos"/>
           <w:b/>
           <w:bCs/>
           <w:noProof/>
@@ -71,7 +71,7 @@
       <w:pPr>
         <w:jc w:val="center"/>
         <w:rPr>
-          <w:rFonts w:ascii="Roboto" w:hAnsi="Roboto"/>
+          <w:rFonts w:ascii="Aptos" w:hAnsi="Aptos"/>
           <w:b/>
           <w:bCs/>
           <w:color w:val="17457A"/>
@@ -84,7 +84,7 @@
       <w:pPr>
         <w:jc w:val="center"/>
         <w:rPr>
-          <w:rFonts w:ascii="Roboto" w:hAnsi="Roboto"/>
+          <w:rFonts w:ascii="Aptos" w:hAnsi="Aptos"/>
           <w:color w:val="17457A"/>
           <w:sz w:val="24"/>
           <w:szCs w:val="24"/>
@@ -92,7 +92,7 @@
       </w:pPr>
       <w:r>
         <w:rPr>
-          <w:rFonts w:ascii="Roboto" w:hAnsi="Roboto"/>
+          <w:rFonts w:ascii="Aptos" w:hAnsi="Aptos"/>
           <w:b/>
           <w:bCs/>
           <w:color w:val="17457A"/>
@@ -106,7 +106,7 @@
       <w:pPr>
         <w:jc w:val="center"/>
         <w:rPr>
-          <w:rFonts w:ascii="Roboto" w:hAnsi="Roboto"/>
+          <w:rFonts w:ascii="Aptos" w:hAnsi="Aptos"/>
           <w:color w:val="17457A"/>
           <w:sz w:val="24"/>
           <w:szCs w:val="24"/>
@@ -114,7 +114,7 @@
       </w:pPr>
       <w:r>
         <w:rPr>
-          <w:rFonts w:ascii="Roboto" w:hAnsi="Roboto"/>
+          <w:rFonts w:ascii="Aptos" w:hAnsi="Aptos"/>
           <w:b/>
           <w:bCs/>
           <w:color w:val="17457A"/>
@@ -125,7 +125,7 @@
       </w:r>
       <w:r>
         <w:rPr>
-          <w:rFonts w:ascii="Roboto" w:hAnsi="Roboto"/>
+          <w:rFonts w:ascii="Aptos" w:hAnsi="Aptos"/>
           <w:b/>
           <w:bCs/>
           <w:color w:val="17457A"/>
@@ -140,7 +140,7 @@
         <w:pStyle w:val="Titre1"/>
         <w:spacing w:before="0" w:after="0"/>
         <w:rPr>
-          <w:rFonts w:ascii="Roboto" w:hAnsi="Roboto"/>
+          <w:rFonts w:ascii="Aptos" w:hAnsi="Aptos"/>
           <w:color w:val="17457A"/>
           <w:sz w:val="22"/>
           <w:szCs w:val="22"/>
@@ -150,15 +150,15 @@
     <w:p>
       <w:pPr>
         <w:rPr>
-          <w:rFonts w:ascii="Roboto" w:hAnsi="Roboto"/>
-          <w:color w:val="17457A"/>
-          <w:sz w:val="22"/>
-          <w:szCs w:val="22"/>
-        </w:rPr>
-      </w:pPr>
-      <w:r>
-        <w:rPr>
-          <w:rFonts w:ascii="Roboto" w:hAnsi="Roboto"/>
+          <w:rFonts w:ascii="Aptos" w:hAnsi="Aptos"/>
+          <w:color w:val="17457A"/>
+          <w:sz w:val="22"/>
+          <w:szCs w:val="22"/>
+        </w:rPr>
+      </w:pPr>
+      <w:r>
+        <w:rPr>
+          <w:rFonts w:ascii="Aptos" w:hAnsi="Aptos"/>
           <w:color w:val="17457A"/>
           <w:sz w:val="22"/>
           <w:szCs w:val="22"/>
@@ -167,7 +167,7 @@
       </w:r>
       <w:r>
         <w:rPr>
-          <w:rFonts w:ascii="Roboto" w:hAnsi="Roboto"/>
+          <w:rFonts w:ascii="Aptos" w:hAnsi="Aptos"/>
           <w:color w:val="17457A"/>
           <w:sz w:val="22"/>
           <w:szCs w:val="22"/>
@@ -176,7 +176,7 @@
       </w:r>
       <w:r>
         <w:rPr>
-          <w:rFonts w:ascii="Roboto" w:hAnsi="Roboto"/>
+          <w:rFonts w:ascii="Aptos" w:hAnsi="Aptos"/>
           <w:color w:val="17457A"/>
           <w:sz w:val="22"/>
           <w:szCs w:val="22"/>
@@ -185,7 +185,7 @@
       </w:r>
       <w:r>
         <w:rPr>
-          <w:rFonts w:ascii="Roboto" w:hAnsi="Roboto"/>
+          <w:rFonts w:ascii="Aptos" w:hAnsi="Aptos"/>
           <w:color w:val="17457A"/>
           <w:sz w:val="22"/>
           <w:szCs w:val="22"/>
@@ -196,7 +196,7 @@
     <w:p>
       <w:pPr>
         <w:rPr>
-          <w:rFonts w:ascii="Roboto" w:hAnsi="Roboto"/>
+          <w:rFonts w:ascii="Aptos" w:hAnsi="Aptos"/>
           <w:color w:val="17457A"/>
           <w:sz w:val="22"/>
           <w:szCs w:val="22"/>
@@ -206,15 +206,15 @@
     <w:p>
       <w:pPr>
         <w:rPr>
-          <w:rFonts w:ascii="Roboto" w:hAnsi="Roboto"/>
-          <w:color w:val="17457A"/>
-          <w:sz w:val="22"/>
-          <w:szCs w:val="22"/>
-        </w:rPr>
-      </w:pPr>
-      <w:r>
-        <w:rPr>
-          <w:rFonts w:ascii="Roboto" w:hAnsi="Roboto"/>
+          <w:rFonts w:ascii="Aptos" w:hAnsi="Aptos"/>
+          <w:color w:val="17457A"/>
+          <w:sz w:val="22"/>
+          <w:szCs w:val="22"/>
+        </w:rPr>
+      </w:pPr>
+      <w:r>
+        <w:rPr>
+          <w:rFonts w:ascii="Aptos" w:hAnsi="Aptos"/>
           <w:color w:val="17457A"/>
           <w:sz w:val="22"/>
           <w:szCs w:val="22"/>
@@ -224,7 +224,7 @@
       <w:proofErr w:type="spellStart"/>
       <w:r>
         <w:rPr>
-          <w:rFonts w:ascii="Roboto" w:hAnsi="Roboto"/>
+          <w:rFonts w:ascii="Aptos" w:hAnsi="Aptos"/>
           <w:color w:val="17457A"/>
           <w:sz w:val="22"/>
           <w:szCs w:val="22"/>
@@ -234,7 +234,7 @@
       <w:proofErr w:type="spellEnd"/>
       <w:r>
         <w:rPr>
-          <w:rFonts w:ascii="Roboto" w:hAnsi="Roboto"/>
+          <w:rFonts w:ascii="Aptos" w:hAnsi="Aptos"/>
           <w:color w:val="17457A"/>
           <w:sz w:val="22"/>
           <w:szCs w:val="22"/>
@@ -245,7 +245,7 @@
     <w:p>
       <w:pPr>
         <w:rPr>
-          <w:rFonts w:ascii="Roboto" w:hAnsi="Roboto"/>
+          <w:rFonts w:ascii="Aptos" w:hAnsi="Aptos"/>
           <w:color w:val="17457A"/>
           <w:sz w:val="22"/>
           <w:szCs w:val="22"/>
@@ -255,15 +255,15 @@
     <w:p>
       <w:pPr>
         <w:rPr>
-          <w:rFonts w:ascii="Roboto" w:hAnsi="Roboto"/>
-          <w:color w:val="17457A"/>
-          <w:sz w:val="22"/>
-          <w:szCs w:val="22"/>
-        </w:rPr>
-      </w:pPr>
-      <w:r>
-        <w:rPr>
-          <w:rFonts w:ascii="Roboto" w:hAnsi="Roboto"/>
+          <w:rFonts w:ascii="Aptos" w:hAnsi="Aptos"/>
+          <w:color w:val="17457A"/>
+          <w:sz w:val="22"/>
+          <w:szCs w:val="22"/>
+        </w:rPr>
+      </w:pPr>
+      <w:r>
+        <w:rPr>
+          <w:rFonts w:ascii="Aptos" w:hAnsi="Aptos"/>
           <w:color w:val="17457A"/>
           <w:sz w:val="22"/>
           <w:szCs w:val="22"/>
@@ -272,7 +272,7 @@
       </w:r>
       <w:r>
         <w:rPr>
-          <w:rFonts w:ascii="Roboto" w:hAnsi="Roboto"/>
+          <w:rFonts w:ascii="Aptos" w:hAnsi="Aptos"/>
           <w:color w:val="17457A"/>
           <w:sz w:val="22"/>
           <w:szCs w:val="22"/>
@@ -281,7 +281,7 @@
       </w:r>
       <w:r>
         <w:rPr>
-          <w:rFonts w:ascii="Roboto" w:hAnsi="Roboto"/>
+          <w:rFonts w:ascii="Aptos" w:hAnsi="Aptos"/>
           <w:color w:val="17457A"/>
           <w:sz w:val="22"/>
           <w:szCs w:val="22"/>
@@ -292,7 +292,7 @@
     <w:p>
       <w:pPr>
         <w:rPr>
-          <w:rFonts w:ascii="Roboto" w:hAnsi="Roboto"/>
+          <w:rFonts w:ascii="Aptos" w:hAnsi="Aptos"/>
           <w:color w:val="17457A"/>
           <w:sz w:val="22"/>
           <w:szCs w:val="22"/>
@@ -302,15 +302,15 @@
     <w:p>
       <w:pPr>
         <w:rPr>
-          <w:rFonts w:ascii="Roboto" w:hAnsi="Roboto"/>
-          <w:color w:val="17457A"/>
-          <w:sz w:val="22"/>
-          <w:szCs w:val="22"/>
-        </w:rPr>
-      </w:pPr>
-      <w:r>
-        <w:rPr>
-          <w:rFonts w:ascii="Roboto" w:hAnsi="Roboto"/>
+          <w:rFonts w:ascii="Aptos" w:hAnsi="Aptos"/>
+          <w:color w:val="17457A"/>
+          <w:sz w:val="22"/>
+          <w:szCs w:val="22"/>
+        </w:rPr>
+      </w:pPr>
+      <w:r>
+        <w:rPr>
+          <w:rFonts w:ascii="Aptos" w:hAnsi="Aptos"/>
           <w:color w:val="17457A"/>
           <w:sz w:val="22"/>
           <w:szCs w:val="22"/>
@@ -323,7 +323,7 @@
         <w:pStyle w:val="Titre1"/>
         <w:spacing w:before="0" w:after="0"/>
         <w:rPr>
-          <w:rFonts w:ascii="Roboto" w:hAnsi="Roboto"/>
+          <w:rFonts w:ascii="Aptos" w:hAnsi="Aptos"/>
           <w:color w:val="17457A"/>
           <w:sz w:val="22"/>
           <w:szCs w:val="22"/>
@@ -335,7 +335,7 @@
         <w:pStyle w:val="Titre1"/>
         <w:spacing w:before="0" w:after="0"/>
         <w:rPr>
-          <w:rFonts w:ascii="Roboto" w:hAnsi="Roboto"/>
+          <w:rFonts w:ascii="Aptos" w:hAnsi="Aptos"/>
           <w:color w:val="17457A"/>
           <w:sz w:val="24"/>
           <w:szCs w:val="24"/>
@@ -343,7 +343,7 @@
       </w:pPr>
       <w:r>
         <w:rPr>
-          <w:rFonts w:ascii="Roboto" w:hAnsi="Roboto"/>
+          <w:rFonts w:ascii="Aptos" w:hAnsi="Aptos"/>
           <w:color w:val="17457A"/>
           <w:sz w:val="24"/>
           <w:szCs w:val="24"/>
@@ -356,7 +356,7 @@
         <w:pStyle w:val="Titre1"/>
         <w:spacing w:before="0" w:after="0"/>
         <w:rPr>
-          <w:rFonts w:ascii="Roboto" w:hAnsi="Roboto"/>
+          <w:rFonts w:ascii="Aptos" w:hAnsi="Aptos"/>
           <w:color w:val="17457A"/>
           <w:sz w:val="22"/>
           <w:szCs w:val="22"/>
@@ -406,7 +406,7 @@
           <w:p>
             <w:pPr>
               <w:rPr>
-                <w:rFonts w:ascii="Roboto" w:hAnsi="Roboto"/>
+                <w:rFonts w:ascii="Aptos" w:hAnsi="Aptos"/>
                 <w:color w:val="17457A"/>
                 <w:sz w:val="22"/>
                 <w:szCs w:val="22"/>
@@ -414,7 +414,7 @@
             </w:pPr>
             <w:r>
               <w:rPr>
-                <w:rFonts w:ascii="Roboto" w:hAnsi="Roboto"/>
+                <w:rFonts w:ascii="Aptos" w:hAnsi="Aptos"/>
                 <w:b/>
                 <w:bCs/>
                 <w:color w:val="17457A"/>
@@ -445,7 +445,7 @@
           <w:p>
             <w:pPr>
               <w:rPr>
-                <w:rFonts w:ascii="Roboto" w:hAnsi="Roboto"/>
+                <w:rFonts w:ascii="Aptos" w:hAnsi="Aptos"/>
                 <w:color w:val="17457A"/>
                 <w:sz w:val="22"/>
                 <w:szCs w:val="22"/>
@@ -453,7 +453,7 @@
             </w:pPr>
             <w:r>
               <w:rPr>
-                <w:rFonts w:ascii="Roboto" w:hAnsi="Roboto"/>
+                <w:rFonts w:ascii="Aptos" w:hAnsi="Aptos"/>
                 <w:color w:val="17457A"/>
                 <w:sz w:val="22"/>
                 <w:szCs w:val="22"/>
@@ -463,7 +463,7 @@
             <w:proofErr w:type="spellStart"/>
             <w:r>
               <w:rPr>
-                <w:rFonts w:ascii="Roboto" w:hAnsi="Roboto"/>
+                <w:rFonts w:ascii="Aptos" w:hAnsi="Aptos"/>
                 <w:color w:val="17457A"/>
                 <w:sz w:val="22"/>
                 <w:szCs w:val="22"/>
@@ -473,7 +473,7 @@
             <w:proofErr w:type="spellEnd"/>
             <w:r>
               <w:rPr>
-                <w:rFonts w:ascii="Roboto" w:hAnsi="Roboto"/>
+                <w:rFonts w:ascii="Aptos" w:hAnsi="Aptos"/>
                 <w:color w:val="17457A"/>
                 <w:sz w:val="22"/>
                 <w:szCs w:val="22"/>
@@ -483,7 +483,7 @@
             <w:proofErr w:type="spellStart"/>
             <w:r>
               <w:rPr>
-                <w:rFonts w:ascii="Roboto" w:hAnsi="Roboto"/>
+                <w:rFonts w:ascii="Aptos" w:hAnsi="Aptos"/>
                 <w:color w:val="17457A"/>
                 <w:sz w:val="22"/>
                 <w:szCs w:val="22"/>
@@ -493,7 +493,7 @@
             <w:proofErr w:type="spellEnd"/>
             <w:r>
               <w:rPr>
-                <w:rFonts w:ascii="Roboto" w:hAnsi="Roboto"/>
+                <w:rFonts w:ascii="Aptos" w:hAnsi="Aptos"/>
                 <w:color w:val="17457A"/>
                 <w:sz w:val="22"/>
                 <w:szCs w:val="22"/>
@@ -503,7 +503,7 @@
             <w:proofErr w:type="spellStart"/>
             <w:r>
               <w:rPr>
-                <w:rFonts w:ascii="Roboto" w:hAnsi="Roboto"/>
+                <w:rFonts w:ascii="Aptos" w:hAnsi="Aptos"/>
                 <w:color w:val="17457A"/>
                 <w:sz w:val="22"/>
                 <w:szCs w:val="22"/>
@@ -513,7 +513,7 @@
             <w:proofErr w:type="spellEnd"/>
             <w:r>
               <w:rPr>
-                <w:rFonts w:ascii="Roboto" w:hAnsi="Roboto"/>
+                <w:rFonts w:ascii="Aptos" w:hAnsi="Aptos"/>
                 <w:color w:val="17457A"/>
                 <w:sz w:val="22"/>
                 <w:szCs w:val="22"/>
@@ -523,7 +523,7 @@
             <w:proofErr w:type="spellStart"/>
             <w:r>
               <w:rPr>
-                <w:rFonts w:ascii="Roboto" w:hAnsi="Roboto"/>
+                <w:rFonts w:ascii="Aptos" w:hAnsi="Aptos"/>
                 <w:color w:val="17457A"/>
                 <w:sz w:val="22"/>
                 <w:szCs w:val="22"/>
@@ -533,7 +533,7 @@
             <w:proofErr w:type="spellEnd"/>
             <w:r>
               <w:rPr>
-                <w:rFonts w:ascii="Roboto" w:hAnsi="Roboto"/>
+                <w:rFonts w:ascii="Aptos" w:hAnsi="Aptos"/>
                 <w:color w:val="17457A"/>
                 <w:sz w:val="22"/>
                 <w:szCs w:val="22"/>
@@ -543,7 +543,7 @@
             <w:proofErr w:type="spellStart"/>
             <w:r>
               <w:rPr>
-                <w:rFonts w:ascii="Roboto" w:hAnsi="Roboto"/>
+                <w:rFonts w:ascii="Aptos" w:hAnsi="Aptos"/>
                 <w:color w:val="17457A"/>
                 <w:sz w:val="22"/>
                 <w:szCs w:val="22"/>
@@ -553,7 +553,7 @@
             <w:proofErr w:type="spellEnd"/>
             <w:r>
               <w:rPr>
-                <w:rFonts w:ascii="Roboto" w:hAnsi="Roboto"/>
+                <w:rFonts w:ascii="Aptos" w:hAnsi="Aptos"/>
                 <w:color w:val="17457A"/>
                 <w:sz w:val="22"/>
                 <w:szCs w:val="22"/>
@@ -563,7 +563,7 @@
             <w:proofErr w:type="spellStart"/>
             <w:r>
               <w:rPr>
-                <w:rFonts w:ascii="Roboto" w:hAnsi="Roboto"/>
+                <w:rFonts w:ascii="Aptos" w:hAnsi="Aptos"/>
                 <w:color w:val="17457A"/>
                 <w:sz w:val="22"/>
                 <w:szCs w:val="22"/>
@@ -573,7 +573,7 @@
             <w:proofErr w:type="spellEnd"/>
             <w:r>
               <w:rPr>
-                <w:rFonts w:ascii="Roboto" w:hAnsi="Roboto"/>
+                <w:rFonts w:ascii="Aptos" w:hAnsi="Aptos"/>
                 <w:color w:val="17457A"/>
                 <w:sz w:val="22"/>
                 <w:szCs w:val="22"/>
@@ -605,7 +605,7 @@
           <w:p>
             <w:pPr>
               <w:rPr>
-                <w:rFonts w:ascii="Roboto" w:hAnsi="Roboto"/>
+                <w:rFonts w:ascii="Aptos" w:hAnsi="Aptos"/>
                 <w:color w:val="17457A"/>
                 <w:sz w:val="22"/>
                 <w:szCs w:val="22"/>
@@ -613,7 +613,7 @@
             </w:pPr>
             <w:r>
               <w:rPr>
-                <w:rFonts w:ascii="Roboto" w:hAnsi="Roboto"/>
+                <w:rFonts w:ascii="Aptos" w:hAnsi="Aptos"/>
                 <w:b/>
                 <w:bCs/>
                 <w:color w:val="17457A"/>
@@ -644,7 +644,7 @@
           <w:p>
             <w:pPr>
               <w:rPr>
-                <w:rFonts w:ascii="Roboto" w:hAnsi="Roboto"/>
+                <w:rFonts w:ascii="Aptos" w:hAnsi="Aptos"/>
                 <w:color w:val="17457A"/>
                 <w:sz w:val="22"/>
                 <w:szCs w:val="22"/>
@@ -652,7 +652,7 @@
             </w:pPr>
             <w:r>
               <w:rPr>
-                <w:rFonts w:ascii="Roboto" w:hAnsi="Roboto"/>
+                <w:rFonts w:ascii="Aptos" w:hAnsi="Aptos"/>
                 <w:color w:val="17457A"/>
                 <w:sz w:val="22"/>
                 <w:szCs w:val="22"/>
@@ -662,7 +662,7 @@
             <w:proofErr w:type="spellStart"/>
             <w:r>
               <w:rPr>
-                <w:rFonts w:ascii="Roboto" w:hAnsi="Roboto"/>
+                <w:rFonts w:ascii="Aptos" w:hAnsi="Aptos"/>
                 <w:color w:val="17457A"/>
                 <w:sz w:val="22"/>
                 <w:szCs w:val="22"/>
@@ -672,7 +672,7 @@
             <w:proofErr w:type="spellEnd"/>
             <w:r>
               <w:rPr>
-                <w:rFonts w:ascii="Roboto" w:hAnsi="Roboto"/>
+                <w:rFonts w:ascii="Aptos" w:hAnsi="Aptos"/>
                 <w:color w:val="17457A"/>
                 <w:sz w:val="22"/>
                 <w:szCs w:val="22"/>
@@ -704,7 +704,7 @@
           <w:p>
             <w:pPr>
               <w:rPr>
-                <w:rFonts w:ascii="Roboto" w:hAnsi="Roboto"/>
+                <w:rFonts w:ascii="Aptos" w:hAnsi="Aptos"/>
                 <w:color w:val="17457A"/>
                 <w:sz w:val="22"/>
                 <w:szCs w:val="22"/>
@@ -712,7 +712,7 @@
             </w:pPr>
             <w:r>
               <w:rPr>
-                <w:rFonts w:ascii="Roboto" w:hAnsi="Roboto"/>
+                <w:rFonts w:ascii="Aptos" w:hAnsi="Aptos"/>
                 <w:b/>
                 <w:bCs/>
                 <w:color w:val="17457A"/>
@@ -743,7 +743,7 @@
           <w:p>
             <w:pPr>
               <w:rPr>
-                <w:rFonts w:ascii="Roboto" w:hAnsi="Roboto"/>
+                <w:rFonts w:ascii="Aptos" w:hAnsi="Aptos"/>
                 <w:color w:val="17457A"/>
                 <w:sz w:val="22"/>
                 <w:szCs w:val="22"/>
@@ -751,7 +751,7 @@
             </w:pPr>
             <w:r>
               <w:rPr>
-                <w:rFonts w:ascii="Roboto" w:hAnsi="Roboto"/>
+                <w:rFonts w:ascii="Aptos" w:hAnsi="Aptos"/>
                 <w:color w:val="17457A"/>
                 <w:sz w:val="22"/>
                 <w:szCs w:val="22"/>
@@ -783,7 +783,7 @@
           <w:p>
             <w:pPr>
               <w:rPr>
-                <w:rFonts w:ascii="Roboto" w:hAnsi="Roboto"/>
+                <w:rFonts w:ascii="Aptos" w:hAnsi="Aptos"/>
                 <w:color w:val="17457A"/>
                 <w:sz w:val="22"/>
                 <w:szCs w:val="22"/>
@@ -791,7 +791,7 @@
             </w:pPr>
             <w:r>
               <w:rPr>
-                <w:rFonts w:ascii="Roboto" w:hAnsi="Roboto"/>
+                <w:rFonts w:ascii="Aptos" w:hAnsi="Aptos"/>
                 <w:b/>
                 <w:bCs/>
                 <w:color w:val="17457A"/>
@@ -822,7 +822,7 @@
           <w:p>
             <w:pPr>
               <w:rPr>
-                <w:rFonts w:ascii="Roboto" w:hAnsi="Roboto"/>
+                <w:rFonts w:ascii="Aptos" w:hAnsi="Aptos"/>
                 <w:color w:val="17457A"/>
                 <w:sz w:val="22"/>
                 <w:szCs w:val="22"/>
@@ -831,7 +831,7 @@
             </w:pPr>
             <w:r>
               <w:rPr>
-                <w:rFonts w:ascii="Roboto" w:hAnsi="Roboto"/>
+                <w:rFonts w:ascii="Aptos" w:hAnsi="Aptos"/>
                 <w:color w:val="17457A"/>
                 <w:sz w:val="22"/>
                 <w:szCs w:val="22"/>
@@ -842,7 +842,7 @@
             <w:proofErr w:type="spellStart"/>
             <w:r>
               <w:rPr>
-                <w:rFonts w:ascii="Roboto" w:hAnsi="Roboto"/>
+                <w:rFonts w:ascii="Aptos" w:hAnsi="Aptos"/>
                 <w:color w:val="17457A"/>
                 <w:sz w:val="22"/>
                 <w:szCs w:val="22"/>
@@ -853,7 +853,7 @@
             <w:proofErr w:type="spellEnd"/>
             <w:r>
               <w:rPr>
-                <w:rFonts w:ascii="Roboto" w:hAnsi="Roboto"/>
+                <w:rFonts w:ascii="Aptos" w:hAnsi="Aptos"/>
                 <w:color w:val="17457A"/>
                 <w:sz w:val="22"/>
                 <w:szCs w:val="22"/>
@@ -886,7 +886,7 @@
           <w:p>
             <w:pPr>
               <w:rPr>
-                <w:rFonts w:ascii="Roboto" w:hAnsi="Roboto"/>
+                <w:rFonts w:ascii="Aptos" w:hAnsi="Aptos"/>
                 <w:color w:val="17457A"/>
                 <w:sz w:val="22"/>
                 <w:szCs w:val="22"/>
@@ -894,7 +894,7 @@
             </w:pPr>
             <w:r>
               <w:rPr>
-                <w:rFonts w:ascii="Roboto" w:hAnsi="Roboto"/>
+                <w:rFonts w:ascii="Aptos" w:hAnsi="Aptos"/>
                 <w:b/>
                 <w:bCs/>
                 <w:color w:val="17457A"/>
@@ -925,7 +925,7 @@
           <w:p>
             <w:pPr>
               <w:rPr>
-                <w:rFonts w:ascii="Roboto" w:hAnsi="Roboto"/>
+                <w:rFonts w:ascii="Aptos" w:hAnsi="Aptos"/>
                 <w:color w:val="17457A"/>
                 <w:sz w:val="22"/>
                 <w:szCs w:val="22"/>
@@ -933,7 +933,7 @@
             </w:pPr>
             <w:r>
               <w:rPr>
-                <w:rFonts w:ascii="Roboto" w:hAnsi="Roboto"/>
+                <w:rFonts w:ascii="Aptos" w:hAnsi="Aptos"/>
                 <w:color w:val="17457A"/>
                 <w:sz w:val="22"/>
                 <w:szCs w:val="22"/>
@@ -965,7 +965,7 @@
           <w:p>
             <w:pPr>
               <w:rPr>
-                <w:rFonts w:ascii="Roboto" w:hAnsi="Roboto"/>
+                <w:rFonts w:ascii="Aptos" w:hAnsi="Aptos"/>
                 <w:color w:val="17457A"/>
                 <w:sz w:val="22"/>
                 <w:szCs w:val="22"/>
@@ -973,7 +973,7 @@
             </w:pPr>
             <w:r>
               <w:rPr>
-                <w:rFonts w:ascii="Roboto" w:hAnsi="Roboto"/>
+                <w:rFonts w:ascii="Aptos" w:hAnsi="Aptos"/>
                 <w:b/>
                 <w:bCs/>
                 <w:color w:val="17457A"/>
@@ -1004,7 +1004,7 @@
           <w:p>
             <w:pPr>
               <w:rPr>
-                <w:rFonts w:ascii="Roboto" w:hAnsi="Roboto"/>
+                <w:rFonts w:ascii="Aptos" w:hAnsi="Aptos"/>
                 <w:color w:val="17457A"/>
                 <w:sz w:val="22"/>
                 <w:szCs w:val="22"/>
@@ -1012,7 +1012,7 @@
             </w:pPr>
             <w:r>
               <w:rPr>
-                <w:rFonts w:ascii="Roboto" w:hAnsi="Roboto"/>
+                <w:rFonts w:ascii="Aptos" w:hAnsi="Aptos"/>
                 <w:color w:val="17457A"/>
                 <w:sz w:val="22"/>
                 <w:szCs w:val="22"/>
@@ -1044,7 +1044,7 @@
           <w:p>
             <w:pPr>
               <w:rPr>
-                <w:rFonts w:ascii="Roboto" w:hAnsi="Roboto"/>
+                <w:rFonts w:ascii="Aptos" w:hAnsi="Aptos"/>
                 <w:color w:val="17457A"/>
                 <w:sz w:val="22"/>
                 <w:szCs w:val="22"/>
@@ -1052,7 +1052,7 @@
             </w:pPr>
             <w:r>
               <w:rPr>
-                <w:rFonts w:ascii="Roboto" w:hAnsi="Roboto"/>
+                <w:rFonts w:ascii="Aptos" w:hAnsi="Aptos"/>
                 <w:b/>
                 <w:bCs/>
                 <w:color w:val="17457A"/>
@@ -1083,7 +1083,7 @@
           <w:p>
             <w:pPr>
               <w:rPr>
-                <w:rFonts w:ascii="Roboto" w:hAnsi="Roboto"/>
+                <w:rFonts w:ascii="Aptos" w:hAnsi="Aptos"/>
                 <w:color w:val="17457A"/>
                 <w:sz w:val="22"/>
                 <w:szCs w:val="22"/>
@@ -1091,7 +1091,7 @@
             </w:pPr>
             <w:r>
               <w:rPr>
-                <w:rFonts w:ascii="Roboto" w:hAnsi="Roboto"/>
+                <w:rFonts w:ascii="Aptos" w:hAnsi="Aptos"/>
                 <w:color w:val="17457A"/>
                 <w:sz w:val="22"/>
                 <w:szCs w:val="22"/>
@@ -1107,7 +1107,7 @@
         <w:pStyle w:val="Titre1"/>
         <w:spacing w:before="0" w:after="0"/>
         <w:rPr>
-          <w:rFonts w:ascii="Roboto" w:hAnsi="Roboto"/>
+          <w:rFonts w:ascii="Aptos" w:hAnsi="Aptos"/>
           <w:color w:val="17457A"/>
           <w:sz w:val="22"/>
           <w:szCs w:val="22"/>
@@ -1119,7 +1119,7 @@
         <w:pStyle w:val="Titre1"/>
         <w:spacing w:before="0" w:after="0"/>
         <w:rPr>
-          <w:rFonts w:ascii="Roboto" w:hAnsi="Roboto"/>
+          <w:rFonts w:ascii="Aptos" w:hAnsi="Aptos"/>
           <w:color w:val="17457A"/>
           <w:sz w:val="24"/>
           <w:szCs w:val="24"/>
@@ -1127,7 +1127,7 @@
       </w:pPr>
       <w:r>
         <w:rPr>
-          <w:rFonts w:ascii="Roboto" w:hAnsi="Roboto"/>
+          <w:rFonts w:ascii="Aptos" w:hAnsi="Aptos"/>
           <w:color w:val="17457A"/>
           <w:sz w:val="24"/>
           <w:szCs w:val="24"/>
@@ -1140,7 +1140,7 @@
         <w:pStyle w:val="Titre1"/>
         <w:spacing w:before="0" w:after="0"/>
         <w:rPr>
-          <w:rFonts w:ascii="Roboto" w:hAnsi="Roboto"/>
+          <w:rFonts w:ascii="Aptos" w:hAnsi="Aptos"/>
           <w:color w:val="17457A"/>
           <w:sz w:val="22"/>
           <w:szCs w:val="22"/>
@@ -1150,7 +1150,7 @@
     <w:p>
       <w:pPr>
         <w:rPr>
-          <w:rFonts w:ascii="Roboto" w:hAnsi="Roboto"/>
+          <w:rFonts w:ascii="Aptos" w:hAnsi="Aptos"/>
           <w:i/>
           <w:iCs/>
           <w:color w:val="17457A"/>
@@ -1160,7 +1160,7 @@
       </w:pPr>
       <w:r>
         <w:rPr>
-          <w:rFonts w:ascii="Roboto" w:hAnsi="Roboto"/>
+          <w:rFonts w:ascii="Aptos" w:hAnsi="Aptos"/>
           <w:i/>
           <w:iCs/>
           <w:color w:val="17457A"/>
@@ -1175,7 +1175,7 @@
         <w:pStyle w:val="Titre1"/>
         <w:spacing w:before="0" w:after="0"/>
         <w:rPr>
-          <w:rFonts w:ascii="Roboto" w:hAnsi="Roboto"/>
+          <w:rFonts w:ascii="Aptos" w:hAnsi="Aptos"/>
           <w:color w:val="17457A"/>
           <w:sz w:val="22"/>
           <w:szCs w:val="22"/>
@@ -1187,7 +1187,7 @@
         <w:pStyle w:val="Titre1"/>
         <w:spacing w:before="0" w:after="0"/>
         <w:rPr>
-          <w:rFonts w:ascii="Roboto" w:hAnsi="Roboto"/>
+          <w:rFonts w:ascii="Aptos" w:hAnsi="Aptos"/>
           <w:color w:val="17457A"/>
           <w:sz w:val="22"/>
           <w:szCs w:val="22"/>
@@ -1199,7 +1199,7 @@
         <w:pStyle w:val="Titre1"/>
         <w:spacing w:before="0" w:after="0"/>
         <w:rPr>
-          <w:rFonts w:ascii="Roboto" w:hAnsi="Roboto"/>
+          <w:rFonts w:ascii="Aptos" w:hAnsi="Aptos"/>
           <w:color w:val="17457A"/>
           <w:sz w:val="24"/>
           <w:szCs w:val="24"/>
@@ -1207,7 +1207,7 @@
       </w:pPr>
       <w:r>
         <w:rPr>
-          <w:rFonts w:ascii="Roboto" w:hAnsi="Roboto"/>
+          <w:rFonts w:ascii="Aptos" w:hAnsi="Aptos"/>
           <w:color w:val="17457A"/>
           <w:sz w:val="24"/>
           <w:szCs w:val="24"/>
@@ -1221,7 +1221,7 @@
         <w:pStyle w:val="Titre1"/>
         <w:spacing w:before="0" w:after="0"/>
         <w:rPr>
-          <w:rFonts w:ascii="Roboto" w:hAnsi="Roboto"/>
+          <w:rFonts w:ascii="Aptos" w:hAnsi="Aptos"/>
           <w:color w:val="17457A"/>
           <w:sz w:val="22"/>
           <w:szCs w:val="22"/>
@@ -1234,15 +1234,15 @@
           <w:bottom w:val="single" w:sz="4" w:space="1" w:color="auto"/>
         </w:pBdr>
         <w:rPr>
-          <w:rFonts w:ascii="Roboto" w:hAnsi="Roboto"/>
-          <w:color w:val="17457A"/>
-          <w:sz w:val="22"/>
-          <w:szCs w:val="22"/>
-        </w:rPr>
-      </w:pPr>
-      <w:r>
-        <w:rPr>
-          <w:rFonts w:ascii="Roboto" w:hAnsi="Roboto"/>
+          <w:rFonts w:ascii="Aptos" w:hAnsi="Aptos"/>
+          <w:color w:val="17457A"/>
+          <w:sz w:val="22"/>
+          <w:szCs w:val="22"/>
+        </w:rPr>
+      </w:pPr>
+      <w:r>
+        <w:rPr>
+          <w:rFonts w:ascii="Aptos" w:hAnsi="Aptos"/>
           <w:b/>
           <w:bCs/>
           <w:color w:val="17457A"/>
@@ -1254,7 +1254,7 @@
       <w:proofErr w:type="gramStart"/>
       <w:r>
         <w:rPr>
-          <w:rFonts w:ascii="Roboto" w:hAnsi="Roboto"/>
+          <w:rFonts w:ascii="Aptos" w:hAnsi="Aptos"/>
           <w:b/>
           <w:bCs/>
           <w:color w:val="17457A"/>
@@ -1265,7 +1265,7 @@
       </w:r>
       <w:r>
         <w:rPr>
-          <w:rFonts w:ascii="Roboto" w:hAnsi="Roboto"/>
+          <w:rFonts w:ascii="Aptos" w:hAnsi="Aptos"/>
           <w:b/>
           <w:bCs/>
           <w:color w:val="17457A"/>
@@ -1277,7 +1277,7 @@
       <w:proofErr w:type="gramEnd"/>
       <w:r>
         <w:rPr>
-          <w:rFonts w:ascii="Roboto" w:hAnsi="Roboto"/>
+          <w:rFonts w:ascii="Aptos" w:hAnsi="Aptos"/>
           <w:b/>
           <w:bCs/>
           <w:color w:val="17457A"/>
@@ -1288,7 +1288,7 @@
       </w:r>
       <w:r>
         <w:rPr>
-          <w:rFonts w:ascii="Roboto" w:hAnsi="Roboto"/>
+          <w:rFonts w:ascii="Aptos" w:hAnsi="Aptos"/>
           <w:b/>
           <w:bCs/>
           <w:color w:val="17457A"/>
@@ -1301,7 +1301,7 @@
     <w:p>
       <w:pPr>
         <w:rPr>
-          <w:rFonts w:ascii="Roboto" w:hAnsi="Roboto"/>
+          <w:rFonts w:ascii="Aptos" w:hAnsi="Aptos"/>
           <w:i/>
           <w:iCs/>
           <w:color w:val="17457A"/>
@@ -1311,7 +1311,7 @@
       </w:pPr>
       <w:r>
         <w:rPr>
-          <w:rFonts w:ascii="Roboto" w:hAnsi="Roboto"/>
+          <w:rFonts w:ascii="Aptos" w:hAnsi="Aptos"/>
           <w:i/>
           <w:iCs/>
           <w:color w:val="17457A"/>
@@ -1326,7 +1326,7 @@
         <w:pStyle w:val="Titre1"/>
         <w:spacing w:before="0" w:after="0"/>
         <w:rPr>
-          <w:rFonts w:ascii="Roboto" w:hAnsi="Roboto"/>
+          <w:rFonts w:ascii="Aptos" w:hAnsi="Aptos"/>
           <w:color w:val="17457A"/>
           <w:sz w:val="22"/>
           <w:szCs w:val="22"/>
@@ -1341,15 +1341,15 @@
           <w:numId w:val="4"/>
         </w:numPr>
         <w:rPr>
-          <w:rFonts w:ascii="Roboto" w:hAnsi="Roboto"/>
-          <w:color w:val="17457A"/>
-          <w:sz w:val="22"/>
-          <w:szCs w:val="22"/>
-        </w:rPr>
-      </w:pPr>
-      <w:r>
-        <w:rPr>
-          <w:rFonts w:ascii="Roboto" w:hAnsi="Roboto"/>
+          <w:rFonts w:ascii="Aptos" w:hAnsi="Aptos"/>
+          <w:color w:val="17457A"/>
+          <w:sz w:val="22"/>
+          <w:szCs w:val="22"/>
+        </w:rPr>
+      </w:pPr>
+      <w:r>
+        <w:rPr>
+          <w:rFonts w:ascii="Aptos" w:hAnsi="Aptos"/>
           <w:color w:val="17457A"/>
           <w:sz w:val="22"/>
           <w:szCs w:val="22"/>
@@ -1360,7 +1360,7 @@
     <w:p>
       <w:pPr>
         <w:rPr>
-          <w:rFonts w:ascii="Roboto" w:hAnsi="Roboto"/>
+          <w:rFonts w:ascii="Aptos" w:hAnsi="Aptos"/>
           <w:color w:val="17457A"/>
           <w:sz w:val="22"/>
           <w:szCs w:val="22"/>
@@ -1369,7 +1369,7 @@
       </w:pPr>
       <w:r>
         <w:rPr>
-          <w:rFonts w:ascii="Roboto" w:hAnsi="Roboto"/>
+          <w:rFonts w:ascii="Aptos" w:hAnsi="Aptos"/>
           <w:b/>
           <w:bCs/>
           <w:i/>
@@ -1383,7 +1383,7 @@
       </w:r>
       <w:r>
         <w:rPr>
-          <w:rFonts w:ascii="Roboto" w:hAnsi="Roboto"/>
+          <w:rFonts w:ascii="Aptos" w:hAnsi="Aptos"/>
           <w:b/>
           <w:bCs/>
           <w:i/>
@@ -1397,7 +1397,7 @@
       </w:r>
       <w:r>
         <w:rPr>
-          <w:rFonts w:ascii="Roboto" w:hAnsi="Roboto"/>
+          <w:rFonts w:ascii="Aptos" w:hAnsi="Aptos"/>
           <w:i/>
           <w:iCs/>
           <w:color w:val="17457A"/>
@@ -1410,7 +1410,7 @@
       <w:proofErr w:type="spellStart"/>
       <w:r>
         <w:rPr>
-          <w:rFonts w:ascii="Roboto" w:hAnsi="Roboto"/>
+          <w:rFonts w:ascii="Aptos" w:hAnsi="Aptos"/>
           <w:i/>
           <w:iCs/>
           <w:color w:val="17457A"/>
@@ -1423,7 +1423,7 @@
       <w:proofErr w:type="spellEnd"/>
       <w:r>
         <w:rPr>
-          <w:rFonts w:ascii="Roboto" w:hAnsi="Roboto"/>
+          <w:rFonts w:ascii="Aptos" w:hAnsi="Aptos"/>
           <w:i/>
           <w:iCs/>
           <w:color w:val="17457A"/>
@@ -1435,7 +1435,7 @@
       </w:r>
       <w:r>
         <w:rPr>
-          <w:rFonts w:ascii="Roboto" w:hAnsi="Roboto"/>
+          <w:rFonts w:ascii="Aptos" w:hAnsi="Aptos"/>
           <w:i/>
           <w:iCs/>
           <w:color w:val="17457A"/>
@@ -1451,7 +1451,7 @@
         <w:pStyle w:val="Titre1"/>
         <w:spacing w:before="0" w:after="0"/>
         <w:rPr>
-          <w:rFonts w:ascii="Roboto" w:hAnsi="Roboto"/>
+          <w:rFonts w:ascii="Aptos" w:hAnsi="Aptos"/>
           <w:color w:val="17457A"/>
           <w:sz w:val="22"/>
           <w:szCs w:val="22"/>
@@ -1463,7 +1463,7 @@
         <w:pStyle w:val="Titre1"/>
         <w:spacing w:before="0" w:after="0"/>
         <w:rPr>
-          <w:rFonts w:ascii="Roboto" w:hAnsi="Roboto"/>
+          <w:rFonts w:ascii="Aptos" w:hAnsi="Aptos"/>
           <w:color w:val="17457A"/>
           <w:sz w:val="22"/>
           <w:szCs w:val="22"/>

</xml_diff>